<commit_message>
Polish the Title Page and align the data availability statement
Data availability wording is tidied on the Title Page and in the manuscript
Declarations, which must match. Huazhong University of Science and Technology is
written in full as in the cover letter. The fixed JACR data statement, the AI
declaration and the other template sentences are unchanged.

Co-Authored-By: Claude Sonnet 5.5 <noreply@anthropic.com>
Claude-Session: https://claude.ai/code/session_013TkounLTBFVQRstE3VnhkM
</commit_message>
<xml_diff>
--- a/JACR_2_TitlePage.docx
+++ b/JACR_2_TitlePage.docx
@@ -78,7 +78,7 @@
         <w:t>Affiliations:</w:t>
       </w:r>
       <w:r>
-        <w:t xml:space="preserve"> ¹ Department of General Surgery, Wuhan Children's Hospital (Wuhan Maternal and Child Healthcare Hospital), Tongji Medical College, Huazhong University of Science &amp; Technology, Wuhan 430016, Hubei Province, China. ² Department of Ultrasound Imaging, Wuhan Children's Hospital (Wuhan Maternal and Child Healthcare Hospital), Tongji Medical College, Huazhong University of Science &amp; Technology, Wuhan 430016, Hubei Province, China.</w:t>
+        <w:t xml:space="preserve"> ¹ Department of General Surgery, Wuhan Children's Hospital (Wuhan Maternal and Child Healthcare Hospital), Tongji Medical College, Huazhong University of Science and Technology, Wuhan 430016, Hubei Province, China. ² Department of Ultrasound Imaging, Wuhan Children's Hospital (Wuhan Maternal and Child Healthcare Hospital), Tongji Medical College, Huazhong University of Science and Technology, Wuhan 430016, Hubei Province, China.</w:t>
       </w:r>
     </w:p>
     <w:p>
@@ -106,7 +106,7 @@
         <w:t>Corresponding author:</w:t>
       </w:r>
       <w:r>
-        <w:t xml:space="preserve"> Jun Yang, Department of General Surgery, Wuhan Children's Hospital (Wuhan Maternal and Child Healthcare Hospital), Tongji Medical College, Huazhong University of Science &amp; Technology, 100 Hong Kong Road, Jiang'an District, Wuhan 430016, Hubei Province, China. Email: yjun201602@163.com. Telephone: +86 186 2713 9911. ORCID: https://orcid.org/0009-0006-0669-4340</w:t>
+        <w:t xml:space="preserve"> Jun Yang, Department of General Surgery, Wuhan Children's Hospital (Wuhan Maternal and Child Healthcare Hospital), Tongji Medical College, Huazhong University of Science and Technology, 100 Hong Kong Road, Jiang'an District, Wuhan 430016, Hubei Province, China. Email: yjun201602@163.com. Telephone: +86 186 2713 9911. ORCID: https://orcid.org/0009-0006-0669-4340</w:t>
       </w:r>
     </w:p>
     <w:p>
@@ -258,7 +258,7 @@
         <w:t>Data availability:</w:t>
       </w:r>
       <w:r>
-        <w:t xml:space="preserve"> The de-identified analysis dataset used pseudonymized research identifiers rather than direct identifiers; it is nonetheless not publicly available because of institutional and ethical restrictions on sharing patient-level clinical data and the potential for re-identification within this small, single-center disease cohort. The complete text-classification rule set, a runnable reference implementation of it, and the report-content audit patterns are provided in Supplement 1. The scripts implementing every model, table and figure are available from the corresponding author on request. De-identified data may be made available by the corresponding author upon reasonable request and with permission of the institutional review board.</w:t>
+        <w:t xml:space="preserve"> The de-identified analysis dataset contains pseudonymized research identifiers rather than direct identifiers. It is nonetheless not publicly available because of institutional and ethical restrictions on sharing patient-level clinical data and the potential for re-identification within this small, single-center disease cohort. The complete text-classification rule set, a runnable reference implementation of it, and the report-content audit patterns are provided in Supplement 1. The scripts implementing every model, table and figure are available from the corresponding author on request. De-identified data may be made available by the corresponding author on reasonable request and with the permission of the institutional review board.</w:t>
       </w:r>
     </w:p>
     <w:p>

</xml_diff>